<commit_message>
Logic Components almost OK.
</commit_message>
<xml_diff>
--- a/docs/文件子系统/API文档.docx
+++ b/docs/文件子系统/API文档.docx
@@ -441,11 +441,6 @@
       </w:r>
     </w:p>
     <w:p>
-      <w:pPr>
-        <w:rPr>
-          <w:rFonts w:hint="eastAsia"/>
-        </w:rPr>
-      </w:pPr>
       <w:r>
         <w:t>…</w:t>
       </w:r>
@@ -770,11 +765,6 @@
       </w:r>
     </w:p>
     <w:p>
-      <w:pPr>
-        <w:rPr>
-          <w:rFonts w:hint="eastAsia"/>
-        </w:rPr>
-      </w:pPr>
       <w:proofErr w:type="spellStart"/>
       <w:r>
         <w:rPr>
@@ -1005,7 +995,7 @@
         <w:t>：str</w:t>
       </w:r>
       <w:r>
-        <w:t xml:space="preserve">[&lt;30] </w:t>
+        <w:t xml:space="preserve"> </w:t>
       </w:r>
       <w:r>
         <w:rPr>
@@ -1083,60 +1073,35 @@
         <w:t>：</w:t>
       </w:r>
       <w:r>
-        <w:t>str[32],</w:t>
-      </w:r>
-      <w:r>
+        <w:t>str</w:t>
+      </w:r>
+    </w:p>
+    <w:p>
+      <w:proofErr w:type="spellStart"/>
+      <w:r>
+        <w:rPr>
+          <w:rFonts w:hint="eastAsia"/>
+        </w:rPr>
+        <w:t>hash</w:t>
+      </w:r>
+      <w:r>
+        <w:t>ed_pw</w:t>
+      </w:r>
+      <w:proofErr w:type="spellEnd"/>
+      <w:r>
+        <w:t xml:space="preserve">: </w:t>
+      </w:r>
+      <w:r>
+        <w:rPr>
+          <w:rFonts w:hint="eastAsia"/>
+        </w:rPr>
         <w:t xml:space="preserve"> </w:t>
       </w:r>
-      <w:proofErr w:type="spellStart"/>
-      <w:r>
-        <w:rPr>
-          <w:rFonts w:hint="eastAsia"/>
-        </w:rPr>
-        <w:t>uuid</w:t>
-      </w:r>
-      <w:proofErr w:type="spellEnd"/>
-    </w:p>
-    <w:p>
-      <w:proofErr w:type="spellStart"/>
-      <w:r>
-        <w:rPr>
-          <w:rFonts w:hint="eastAsia"/>
-        </w:rPr>
-        <w:t>hash</w:t>
-      </w:r>
-      <w:r>
-        <w:t>ed_pw</w:t>
-      </w:r>
-      <w:proofErr w:type="spellEnd"/>
-      <w:r>
-        <w:t xml:space="preserve">: </w:t>
-      </w:r>
-      <w:r>
-        <w:rPr>
-          <w:rFonts w:hint="eastAsia"/>
-        </w:rPr>
-        <w:t xml:space="preserve"> </w:t>
-      </w:r>
-      <w:proofErr w:type="spellStart"/>
-      <w:r>
-        <w:t>hash_bytes</w:t>
-      </w:r>
-      <w:proofErr w:type="spellEnd"/>
-      <w:r>
-        <w:rPr>
-          <w:rFonts w:hint="eastAsia"/>
-        </w:rPr>
-        <w:t>（3</w:t>
-      </w:r>
-      <w:r>
-        <w:t>2</w:t>
-      </w:r>
-      <w:r>
-        <w:rPr>
-          <w:rFonts w:hint="eastAsia"/>
-        </w:rPr>
-        <w:t>字节）</w:t>
+      <w:r>
+        <w:rPr>
+          <w:rFonts w:hint="eastAsia"/>
+        </w:rPr>
+        <w:t>str</w:t>
       </w:r>
     </w:p>
     <w:p/>
@@ -1273,32 +1238,29 @@
         <w:rPr>
           <w:rFonts w:hint="eastAsia"/>
         </w:rPr>
-        <w:t>uuid</w:t>
-      </w:r>
-      <w:proofErr w:type="spellEnd"/>
-      <w:r>
-        <w:rPr>
-          <w:rFonts w:hint="eastAsia"/>
-        </w:rPr>
-        <w:t>：3</w:t>
-      </w:r>
-      <w:r>
-        <w:t>2</w:t>
-      </w:r>
-      <w:r>
-        <w:rPr>
-          <w:rFonts w:hint="eastAsia"/>
-        </w:rPr>
-        <w:t>字符</w:t>
-      </w:r>
-      <w:proofErr w:type="spellStart"/>
-      <w:r>
-        <w:rPr>
-          <w:rFonts w:hint="eastAsia"/>
-        </w:rPr>
         <w:t>uid</w:t>
       </w:r>
       <w:proofErr w:type="spellEnd"/>
+      <w:r>
+        <w:rPr>
+          <w:rFonts w:hint="eastAsia"/>
+        </w:rPr>
+        <w:t>：</w:t>
+      </w:r>
+      <w:proofErr w:type="spellStart"/>
+      <w:r>
+        <w:rPr>
+          <w:rFonts w:hint="eastAsia"/>
+        </w:rPr>
+        <w:t>u</w:t>
+      </w:r>
+      <w:r>
+        <w:rPr>
+          <w:rFonts w:hint="eastAsia"/>
+        </w:rPr>
+        <w:t>uid</w:t>
+      </w:r>
+      <w:proofErr w:type="spellEnd"/>
     </w:p>
     <w:p/>
     <w:p>
@@ -1320,7 +1282,7 @@
       </w:r>
       <w:proofErr w:type="spellEnd"/>
       <w:r>
-        <w:t xml:space="preserve">(str[32] </w:t>
+        <w:t xml:space="preserve">(str </w:t>
       </w:r>
       <w:proofErr w:type="spellStart"/>
       <w:r>
@@ -1454,7 +1416,7 @@
       </w:r>
       <w:proofErr w:type="spellEnd"/>
       <w:r>
-        <w:t xml:space="preserve"> (str[32] </w:t>
+        <w:t xml:space="preserve"> (str </w:t>
       </w:r>
       <w:proofErr w:type="spellStart"/>
       <w:r>
@@ -1553,6 +1515,37 @@
       </w:r>
     </w:p>
     <w:p>
+      <w:proofErr w:type="spellStart"/>
+      <w:r>
+        <w:rPr>
+          <w:rFonts w:hint="eastAsia"/>
+        </w:rPr>
+        <w:t>dict</w:t>
+      </w:r>
+      <w:proofErr w:type="spellEnd"/>
+      <w:r>
+        <w:t xml:space="preserve"> </w:t>
+      </w:r>
+      <w:proofErr w:type="spellStart"/>
+      <w:r>
+        <w:rPr>
+          <w:rFonts w:hint="eastAsia"/>
+        </w:rPr>
+        <w:t>use</w:t>
+      </w:r>
+      <w:r>
+        <w:t>_detail</w:t>
+      </w:r>
+      <w:r>
+        <w:rPr>
+          <w:rFonts w:hint="eastAsia"/>
+        </w:rPr>
+        <w:t>s</w:t>
+      </w:r>
+      <w:proofErr w:type="spellEnd"/>
+      <w:r>
+        <w:t xml:space="preserve">: </w:t>
+      </w:r>
       <w:r>
         <w:rPr>
           <w:rFonts w:hint="eastAsia"/>
@@ -1611,6 +1604,11 @@
     </w:p>
     <w:p/>
     <w:p>
+      <w:pPr>
+        <w:rPr>
+          <w:rFonts w:hint="eastAsia"/>
+        </w:rPr>
+      </w:pPr>
       <w:r>
         <w:t>10</w:t>
       </w:r>
@@ -1625,14 +1623,271 @@
         <w:rPr>
           <w:rFonts w:hint="eastAsia"/>
         </w:rPr>
-        <w:t>AddNotes</w:t>
-      </w:r>
-      <w:proofErr w:type="spellEnd"/>
-      <w:r>
-        <w:rPr>
-          <w:rFonts w:hint="eastAsia"/>
-        </w:rPr>
-        <w:t>（str</w:t>
+        <w:t>AddNote</w:t>
+      </w:r>
+      <w:proofErr w:type="spellEnd"/>
+      <w:r>
+        <w:rPr>
+          <w:rFonts w:hint="eastAsia"/>
+        </w:rPr>
+        <w:t>（</w:t>
+      </w:r>
+      <w:r>
+        <w:rPr>
+          <w:rFonts w:hint="eastAsia"/>
+        </w:rPr>
+        <w:t>s</w:t>
+      </w:r>
+      <w:r>
+        <w:t>tr</w:t>
+      </w:r>
+      <w:r>
+        <w:rPr>
+          <w:rFonts w:hint="eastAsia"/>
+        </w:rPr>
+        <w:t xml:space="preserve"> </w:t>
+      </w:r>
+      <w:proofErr w:type="spellStart"/>
+      <w:r>
+        <w:t>mapid</w:t>
+      </w:r>
+      <w:proofErr w:type="spellEnd"/>
+      <w:r>
+        <w:t xml:space="preserve">, str </w:t>
+      </w:r>
+      <w:proofErr w:type="spellStart"/>
+      <w:r>
+        <w:t>uuid</w:t>
+      </w:r>
+      <w:proofErr w:type="spellEnd"/>
+      <w:r>
+        <w:t xml:space="preserve">, str </w:t>
+      </w:r>
+      <w:r>
+        <w:t>context</w:t>
+      </w:r>
+      <w:r>
+        <w:rPr>
+          <w:rFonts w:hint="eastAsia"/>
+        </w:rPr>
+        <w:t>）</w:t>
+      </w:r>
+      <w:r>
+        <w:rPr>
+          <w:rFonts w:hint="eastAsia"/>
+        </w:rPr>
+        <w:t>#Note表会自动添加时间</w:t>
+      </w:r>
+    </w:p>
+    <w:p>
+      <w:r>
+        <w:rPr>
+          <w:rFonts w:hint="eastAsia"/>
+        </w:rPr>
+        <w:t>输入：</w:t>
+      </w:r>
+    </w:p>
+    <w:p>
+      <w:r>
+        <w:t>…</w:t>
+      </w:r>
+    </w:p>
+    <w:p>
+      <w:r>
+        <w:rPr>
+          <w:rFonts w:hint="eastAsia"/>
+        </w:rPr>
+        <w:t>输出：</w:t>
+      </w:r>
+    </w:p>
+    <w:p>
+      <w:r>
+        <w:rPr>
+          <w:rFonts w:hint="eastAsia"/>
+        </w:rPr>
+        <w:t>int</w:t>
+      </w:r>
+      <w:r>
+        <w:t xml:space="preserve"> </w:t>
+      </w:r>
+      <w:r>
+        <w:rPr>
+          <w:rFonts w:hint="eastAsia"/>
+        </w:rPr>
+        <w:t>status；状态参数 （0</w:t>
+      </w:r>
+      <w:r>
+        <w:t xml:space="preserve">: </w:t>
+      </w:r>
+      <w:r>
+        <w:rPr>
+          <w:rFonts w:hint="eastAsia"/>
+        </w:rPr>
+        <w:t>OK，2</w:t>
+      </w:r>
+      <w:r>
+        <w:t xml:space="preserve">001: </w:t>
+      </w:r>
+      <w:proofErr w:type="spellStart"/>
+      <w:r>
+        <w:t>UserNotFound</w:t>
+      </w:r>
+      <w:proofErr w:type="spellEnd"/>
+      <w:r>
+        <w:t xml:space="preserve">, 1002: </w:t>
+      </w:r>
+      <w:proofErr w:type="spellStart"/>
+      <w:r>
+        <w:t>MapNotFound</w:t>
+      </w:r>
+      <w:proofErr w:type="spellEnd"/>
+      <w:r>
+        <w:t xml:space="preserve">, 1011: </w:t>
+      </w:r>
+      <w:proofErr w:type="spellStart"/>
+      <w:r>
+        <w:t>AddNoteError</w:t>
+      </w:r>
+      <w:proofErr w:type="spellEnd"/>
+      <w:r>
+        <w:t>）</w:t>
+      </w:r>
+    </w:p>
+    <w:p>
+      <w:r>
+        <w:rPr>
+          <w:rFonts w:hint="eastAsia"/>
+        </w:rPr>
+        <w:t>str</w:t>
+      </w:r>
+      <w:r>
+        <w:t xml:space="preserve"> </w:t>
+      </w:r>
+      <w:proofErr w:type="spellStart"/>
+      <w:r>
+        <w:t>noteid</w:t>
+      </w:r>
+      <w:proofErr w:type="spellEnd"/>
+    </w:p>
+    <w:p/>
+    <w:p>
+      <w:r>
+        <w:rPr>
+          <w:rFonts w:hint="eastAsia"/>
+        </w:rPr>
+        <w:t>1</w:t>
+      </w:r>
+      <w:r>
+        <w:t xml:space="preserve">1, </w:t>
+      </w:r>
+      <w:proofErr w:type="spellStart"/>
+      <w:r>
+        <w:t>DeleteNote</w:t>
+      </w:r>
+      <w:proofErr w:type="spellEnd"/>
+      <w:r>
+        <w:rPr>
+          <w:rFonts w:hint="eastAsia"/>
+        </w:rPr>
+        <w:t>（</w:t>
+      </w:r>
+      <w:r>
+        <w:rPr>
+          <w:rFonts w:hint="eastAsia"/>
+        </w:rPr>
+        <w:t xml:space="preserve"> </w:t>
+      </w:r>
+      <w:proofErr w:type="spellStart"/>
+      <w:r>
+        <w:t>noteid</w:t>
+      </w:r>
+      <w:proofErr w:type="spellEnd"/>
+      <w:r>
+        <w:t>）</w:t>
+      </w:r>
+    </w:p>
+    <w:p>
+      <w:r>
+        <w:rPr>
+          <w:rFonts w:hint="eastAsia"/>
+        </w:rPr>
+        <w:t>输入：</w:t>
+      </w:r>
+    </w:p>
+    <w:p>
+      <w:r>
+        <w:t>…</w:t>
+      </w:r>
+    </w:p>
+    <w:p>
+      <w:r>
+        <w:rPr>
+          <w:rFonts w:hint="eastAsia"/>
+        </w:rPr>
+        <w:t>输出：</w:t>
+      </w:r>
+    </w:p>
+    <w:p>
+      <w:r>
+        <w:rPr>
+          <w:rFonts w:hint="eastAsia"/>
+        </w:rPr>
+        <w:t>int</w:t>
+      </w:r>
+      <w:r>
+        <w:t xml:space="preserve"> </w:t>
+      </w:r>
+      <w:r>
+        <w:rPr>
+          <w:rFonts w:hint="eastAsia"/>
+        </w:rPr>
+        <w:t>status；状态参数 （0</w:t>
+      </w:r>
+      <w:r>
+        <w:t xml:space="preserve">: </w:t>
+      </w:r>
+      <w:r>
+        <w:rPr>
+          <w:rFonts w:hint="eastAsia"/>
+        </w:rPr>
+        <w:t>OK，</w:t>
+      </w:r>
+      <w:r>
+        <w:t xml:space="preserve">1012: </w:t>
+      </w:r>
+      <w:proofErr w:type="spellStart"/>
+      <w:r>
+        <w:t>NoteNotFound</w:t>
+      </w:r>
+      <w:proofErr w:type="spellEnd"/>
+      <w:r>
+        <w:t>, 1013:NoteDeleteError）</w:t>
+      </w:r>
+    </w:p>
+    <w:p/>
+    <w:p>
+      <w:r>
+        <w:rPr>
+          <w:rFonts w:hint="eastAsia"/>
+        </w:rPr>
+        <w:t>1</w:t>
+      </w:r>
+      <w:r>
+        <w:t xml:space="preserve">2, </w:t>
+      </w:r>
+      <w:proofErr w:type="spellStart"/>
+      <w:r>
+        <w:t>GetNotes</w:t>
+      </w:r>
+      <w:proofErr w:type="spellEnd"/>
+      <w:r>
+        <w:t xml:space="preserve">( </w:t>
+      </w:r>
+      <w:r>
+        <w:rPr>
+          <w:rFonts w:hint="eastAsia"/>
+        </w:rPr>
+        <w:t>str</w:t>
       </w:r>
       <w:r>
         <w:t xml:space="preserve">[10] </w:t>
@@ -1643,467 +1898,234 @@
       </w:r>
       <w:proofErr w:type="spellEnd"/>
       <w:r>
-        <w:t xml:space="preserve">, str[32] </w:t>
-      </w:r>
-      <w:proofErr w:type="spellStart"/>
-      <w:r>
-        <w:t>uuid</w:t>
-      </w:r>
-      <w:proofErr w:type="spellEnd"/>
-      <w:r>
-        <w:t xml:space="preserve">, str </w:t>
-      </w:r>
-      <w:r>
-        <w:t>context</w:t>
+        <w:t xml:space="preserve"> = NULL, str[32] </w:t>
+      </w:r>
+      <w:proofErr w:type="spellStart"/>
+      <w:r>
+        <w:t>uid</w:t>
+      </w:r>
+      <w:proofErr w:type="spellEnd"/>
+      <w:r>
+        <w:t xml:space="preserve"> = NULL, count = 0</w:t>
+      </w:r>
+      <w:r>
+        <w:rPr>
+          <w:rFonts w:hint="eastAsia"/>
+        </w:rPr>
+        <w:t>，size</w:t>
+      </w:r>
+      <w:r>
+        <w:t xml:space="preserve"> = 10)</w:t>
+      </w:r>
+    </w:p>
+    <w:p>
+      <w:r>
+        <w:rPr>
+          <w:rFonts w:hint="eastAsia"/>
+        </w:rPr>
+        <w:t>#根据地图的id或者用户的id，或者两者，返回评注信息。</w:t>
+      </w:r>
+    </w:p>
+    <w:p>
+      <w:r>
+        <w:rPr>
+          <w:rFonts w:hint="eastAsia"/>
+        </w:rPr>
+        <w:t>输入：</w:t>
+      </w:r>
+    </w:p>
+    <w:p>
+      <w:proofErr w:type="spellStart"/>
+      <w:r>
+        <w:rPr>
+          <w:rFonts w:hint="eastAsia"/>
+        </w:rPr>
+        <w:lastRenderedPageBreak/>
+        <w:t>m</w:t>
+      </w:r>
+      <w:r>
+        <w:t>apid</w:t>
+      </w:r>
+      <w:proofErr w:type="spellEnd"/>
+      <w:r>
+        <w:t xml:space="preserve">: </w:t>
+      </w:r>
+      <w:r>
+        <w:rPr>
+          <w:rFonts w:hint="eastAsia"/>
+        </w:rPr>
+        <w:t>地图的id，地图id状态会储存在用户程序中。若为空，则查询用户的所有评论。</w:t>
+      </w:r>
+    </w:p>
+    <w:p>
+      <w:proofErr w:type="spellStart"/>
+      <w:r>
+        <w:rPr>
+          <w:rFonts w:hint="eastAsia"/>
+        </w:rPr>
+        <w:t>uid</w:t>
+      </w:r>
+      <w:proofErr w:type="spellEnd"/>
+      <w:r>
+        <w:rPr>
+          <w:rFonts w:hint="eastAsia"/>
+        </w:rPr>
+        <w:t>：用户id，用户的id状态会储存在用户程序中。若为空，则查询用户的所有评论。</w:t>
+      </w:r>
+    </w:p>
+    <w:p>
+      <w:r>
+        <w:rPr>
+          <w:rFonts w:hint="eastAsia"/>
+        </w:rPr>
+        <w:t>count：（根据时间）排序后的符合条件的评论的起始位数</w:t>
+      </w:r>
+      <w:r>
+        <w:rPr>
+          <w:rFonts w:hint="eastAsia"/>
+        </w:rPr>
+        <w:t>，例如第一次count为0查了10条后，第二次则要令count为10</w:t>
+      </w:r>
+    </w:p>
+    <w:p>
+      <w:r>
+        <w:rPr>
+          <w:rFonts w:hint="eastAsia"/>
+        </w:rPr>
+        <w:t>size：一次性返回的评论条数（不足则尽可能返回）</w:t>
+      </w:r>
+    </w:p>
+    <w:p/>
+    <w:p>
+      <w:r>
+        <w:rPr>
+          <w:rFonts w:hint="eastAsia"/>
+        </w:rPr>
+        <w:t>输出：</w:t>
+      </w:r>
+    </w:p>
+    <w:p>
+      <w:r>
+        <w:rPr>
+          <w:rFonts w:hint="eastAsia"/>
+        </w:rPr>
+        <w:t>int</w:t>
+      </w:r>
+      <w:r>
+        <w:t xml:space="preserve"> </w:t>
+      </w:r>
+      <w:r>
+        <w:rPr>
+          <w:rFonts w:hint="eastAsia"/>
+        </w:rPr>
+        <w:t>status；状态参数 （0</w:t>
+      </w:r>
+      <w:r>
+        <w:t xml:space="preserve">: </w:t>
+      </w:r>
+      <w:r>
+        <w:rPr>
+          <w:rFonts w:hint="eastAsia"/>
+        </w:rPr>
+        <w:t>OK，2</w:t>
+      </w:r>
+      <w:r>
+        <w:t xml:space="preserve">001: </w:t>
+      </w:r>
+      <w:proofErr w:type="spellStart"/>
+      <w:r>
+        <w:t>UserNotFound</w:t>
+      </w:r>
+      <w:proofErr w:type="spellEnd"/>
+      <w:r>
+        <w:t xml:space="preserve">, 1002: </w:t>
+      </w:r>
+      <w:proofErr w:type="spellStart"/>
+      <w:r>
+        <w:t>MapNotFound</w:t>
+      </w:r>
+      <w:proofErr w:type="spellEnd"/>
+      <w:r>
+        <w:t xml:space="preserve">, 1014: </w:t>
+      </w:r>
+      <w:proofErr w:type="spellStart"/>
+      <w:r>
+        <w:t>AddNotesError</w:t>
+      </w:r>
+      <w:proofErr w:type="spellEnd"/>
+      <w:r>
+        <w:t>）</w:t>
+      </w:r>
+    </w:p>
+    <w:p>
+      <w:r>
+        <w:rPr>
+          <w:rFonts w:hint="eastAsia"/>
+        </w:rPr>
+        <w:t>list</w:t>
+      </w:r>
+      <w:r>
+        <w:t>[</w:t>
+      </w:r>
+      <w:r>
+        <w:rPr>
+          <w:rFonts w:hint="eastAsia"/>
+        </w:rPr>
+        <w:t>{</w:t>
+      </w:r>
+      <w:proofErr w:type="spellStart"/>
+      <w:r>
+        <w:t>mapid</w:t>
+      </w:r>
+      <w:proofErr w:type="spellEnd"/>
+      <w:r>
+        <w:t xml:space="preserve"> : str</w:t>
       </w:r>
       <w:r>
         <w:t xml:space="preserve">, </w:t>
       </w:r>
       <w:proofErr w:type="spellStart"/>
       <w:r>
-        <w:t>datetime.datetime</w:t>
-      </w:r>
-      <w:proofErr w:type="spellEnd"/>
-      <w:r>
-        <w:rPr>
-          <w:rFonts w:hint="eastAsia"/>
-        </w:rPr>
-        <w:t>：</w:t>
-      </w:r>
-      <w:r>
-        <w:rPr>
-          <w:rFonts w:hint="eastAsia"/>
-        </w:rPr>
-        <w:t>time</w:t>
-      </w:r>
-      <w:r>
-        <w:rPr>
-          <w:rFonts w:hint="eastAsia"/>
-        </w:rPr>
-        <w:t>）</w:t>
-      </w:r>
-    </w:p>
-    <w:p>
-      <w:r>
-        <w:rPr>
-          <w:rFonts w:hint="eastAsia"/>
-        </w:rPr>
-        <w:t>输入：</w:t>
-      </w:r>
-    </w:p>
-    <w:p>
+        <w:t>uid</w:t>
+      </w:r>
+      <w:proofErr w:type="spellEnd"/>
+      <w:r>
+        <w:t xml:space="preserve"> : str</w:t>
+      </w:r>
+      <w:r>
+        <w:t>, time</w:t>
+      </w:r>
+      <w:r>
+        <w:t xml:space="preserve"> : str</w:t>
+      </w:r>
+      <w:r>
+        <w:t>, context</w:t>
+      </w:r>
+      <w:r>
+        <w:t xml:space="preserve"> : str</w:t>
+      </w:r>
+      <w:r>
+        <w:rPr>
+          <w:rFonts w:hint="eastAsia"/>
+        </w:rPr>
+        <w:t>}，</w:t>
+      </w:r>
       <w:r>
         <w:t>…</w:t>
       </w:r>
-    </w:p>
-    <w:p>
-      <w:r>
-        <w:rPr>
-          <w:rFonts w:hint="eastAsia"/>
-        </w:rPr>
-        <w:t>t</w:t>
-      </w:r>
-      <w:r>
-        <w:t xml:space="preserve">ime : </w:t>
-      </w:r>
-      <w:r>
-        <w:rPr>
-          <w:rFonts w:hint="eastAsia"/>
-        </w:rPr>
-        <w:t>时间</w:t>
-      </w:r>
-    </w:p>
-    <w:p>
-      <w:r>
-        <w:rPr>
-          <w:rFonts w:hint="eastAsia"/>
-        </w:rPr>
-        <w:t>输出：</w:t>
-      </w:r>
-    </w:p>
-    <w:p>
-      <w:r>
-        <w:rPr>
-          <w:rFonts w:hint="eastAsia"/>
-        </w:rPr>
-        <w:t>int</w:t>
-      </w:r>
-      <w:r>
-        <w:t xml:space="preserve"> </w:t>
-      </w:r>
-      <w:r>
-        <w:rPr>
-          <w:rFonts w:hint="eastAsia"/>
-        </w:rPr>
-        <w:t>status；状态参数 （0</w:t>
-      </w:r>
-      <w:r>
-        <w:t xml:space="preserve">: </w:t>
-      </w:r>
-      <w:r>
-        <w:rPr>
-          <w:rFonts w:hint="eastAsia"/>
-        </w:rPr>
-        <w:t>OK，2</w:t>
-      </w:r>
-      <w:r>
-        <w:t xml:space="preserve">001: </w:t>
-      </w:r>
-      <w:proofErr w:type="spellStart"/>
-      <w:r>
-        <w:t>UserNotFound</w:t>
-      </w:r>
-      <w:proofErr w:type="spellEnd"/>
-      <w:r>
-        <w:t xml:space="preserve">, 1002: </w:t>
-      </w:r>
-      <w:proofErr w:type="spellStart"/>
-      <w:r>
-        <w:t>MapNotFound</w:t>
-      </w:r>
-      <w:proofErr w:type="spellEnd"/>
-      <w:r>
-        <w:t xml:space="preserve">, 1011: </w:t>
-      </w:r>
-      <w:proofErr w:type="spellStart"/>
-      <w:r>
-        <w:t>AddNotesError</w:t>
-      </w:r>
-      <w:proofErr w:type="spellEnd"/>
-      <w:r>
-        <w:t>）</w:t>
-      </w:r>
-    </w:p>
-    <w:p>
-      <w:proofErr w:type="spellStart"/>
-      <w:r>
-        <w:rPr>
-          <w:rFonts w:hint="eastAsia"/>
-        </w:rPr>
-        <w:t>uuid</w:t>
-      </w:r>
-      <w:proofErr w:type="spellEnd"/>
-      <w:r>
-        <w:t xml:space="preserve"> </w:t>
-      </w:r>
-      <w:proofErr w:type="spellStart"/>
-      <w:r>
-        <w:t>noteid</w:t>
-      </w:r>
-      <w:proofErr w:type="spellEnd"/>
+      <w:r>
+        <w:t>]</w:t>
+      </w:r>
     </w:p>
     <w:p/>
-    <w:p>
-      <w:r>
-        <w:rPr>
-          <w:rFonts w:hint="eastAsia"/>
-        </w:rPr>
-        <w:t>1</w:t>
-      </w:r>
-      <w:r>
-        <w:t xml:space="preserve">1, </w:t>
-      </w:r>
-      <w:proofErr w:type="spellStart"/>
-      <w:r>
-        <w:t>DeleteNote</w:t>
-      </w:r>
-      <w:proofErr w:type="spellEnd"/>
-      <w:r>
-        <w:rPr>
-          <w:rFonts w:hint="eastAsia"/>
-        </w:rPr>
-        <w:t>（str</w:t>
-      </w:r>
-      <w:r>
-        <w:t xml:space="preserve">[16] </w:t>
-      </w:r>
-      <w:proofErr w:type="spellStart"/>
-      <w:r>
-        <w:t>noteid</w:t>
-      </w:r>
-      <w:proofErr w:type="spellEnd"/>
-      <w:r>
-        <w:t>）</w:t>
-      </w:r>
-    </w:p>
-    <w:p>
-      <w:r>
-        <w:rPr>
-          <w:rFonts w:hint="eastAsia"/>
-        </w:rPr>
-        <w:t>输入：</w:t>
-      </w:r>
-    </w:p>
-    <w:p>
-      <w:r>
-        <w:t>…</w:t>
-      </w:r>
-    </w:p>
-    <w:p>
-      <w:r>
-        <w:rPr>
-          <w:rFonts w:hint="eastAsia"/>
-        </w:rPr>
-        <w:t>输出：</w:t>
-      </w:r>
-    </w:p>
-    <w:p>
-      <w:r>
-        <w:rPr>
-          <w:rFonts w:hint="eastAsia"/>
-        </w:rPr>
-        <w:t>int</w:t>
-      </w:r>
-      <w:r>
-        <w:t xml:space="preserve"> </w:t>
-      </w:r>
-      <w:r>
-        <w:rPr>
-          <w:rFonts w:hint="eastAsia"/>
-        </w:rPr>
-        <w:t>status；状态参数 （0</w:t>
-      </w:r>
-      <w:r>
-        <w:t xml:space="preserve">: </w:t>
-      </w:r>
-      <w:r>
-        <w:rPr>
-          <w:rFonts w:hint="eastAsia"/>
-        </w:rPr>
-        <w:t>OK，</w:t>
-      </w:r>
-      <w:r>
-        <w:t xml:space="preserve">1012: </w:t>
-      </w:r>
-      <w:proofErr w:type="spellStart"/>
-      <w:r>
-        <w:t>NoteNotFound</w:t>
-      </w:r>
-      <w:proofErr w:type="spellEnd"/>
-      <w:r>
-        <w:t>, 1013:NoteDeleteError）</w:t>
-      </w:r>
-    </w:p>
     <w:p/>
     <w:p>
-      <w:r>
-        <w:rPr>
-          <w:rFonts w:hint="eastAsia"/>
-        </w:rPr>
-        <w:t>1</w:t>
-      </w:r>
-      <w:r>
-        <w:t xml:space="preserve">2, </w:t>
-      </w:r>
-      <w:proofErr w:type="spellStart"/>
-      <w:r>
-        <w:t>GetNotes</w:t>
-      </w:r>
-      <w:proofErr w:type="spellEnd"/>
-      <w:r>
-        <w:t xml:space="preserve">( </w:t>
-      </w:r>
-      <w:r>
-        <w:rPr>
-          <w:rFonts w:hint="eastAsia"/>
-        </w:rPr>
-        <w:t>str</w:t>
-      </w:r>
-      <w:r>
-        <w:t xml:space="preserve">[10] </w:t>
-      </w:r>
-      <w:proofErr w:type="spellStart"/>
-      <w:r>
-        <w:t>mapid</w:t>
-      </w:r>
-      <w:proofErr w:type="spellEnd"/>
-      <w:r>
-        <w:t xml:space="preserve"> = NULL, str[32] </w:t>
-      </w:r>
-      <w:proofErr w:type="spellStart"/>
-      <w:r>
-        <w:t>uid</w:t>
-      </w:r>
-      <w:proofErr w:type="spellEnd"/>
-      <w:r>
-        <w:t xml:space="preserve"> = NULL, count = 0</w:t>
-      </w:r>
-      <w:r>
-        <w:rPr>
-          <w:rFonts w:hint="eastAsia"/>
-        </w:rPr>
-        <w:t>，size</w:t>
-      </w:r>
-      <w:r>
-        <w:t xml:space="preserve"> = 10)</w:t>
-      </w:r>
-    </w:p>
-    <w:p>
-      <w:r>
-        <w:rPr>
-          <w:rFonts w:hint="eastAsia"/>
-        </w:rPr>
-        <w:t>#根据地图的id或者用户的id，或者两者，返回评注信息。</w:t>
-      </w:r>
-    </w:p>
-    <w:p>
-      <w:r>
-        <w:rPr>
-          <w:rFonts w:hint="eastAsia"/>
-        </w:rPr>
-        <w:lastRenderedPageBreak/>
-        <w:t>输入：</w:t>
-      </w:r>
-    </w:p>
-    <w:p>
-      <w:proofErr w:type="spellStart"/>
-      <w:r>
-        <w:rPr>
-          <w:rFonts w:hint="eastAsia"/>
-        </w:rPr>
-        <w:t>m</w:t>
-      </w:r>
-      <w:r>
-        <w:t>apid</w:t>
-      </w:r>
-      <w:proofErr w:type="spellEnd"/>
-      <w:r>
-        <w:t xml:space="preserve">: </w:t>
-      </w:r>
-      <w:r>
-        <w:rPr>
-          <w:rFonts w:hint="eastAsia"/>
-        </w:rPr>
-        <w:t>地图的id，地图id状态会储存在用户程序中。若为空，则查询用户的所有评论。</w:t>
-      </w:r>
-    </w:p>
-    <w:p>
-      <w:proofErr w:type="spellStart"/>
-      <w:r>
-        <w:rPr>
-          <w:rFonts w:hint="eastAsia"/>
-        </w:rPr>
-        <w:t>uid</w:t>
-      </w:r>
-      <w:proofErr w:type="spellEnd"/>
-      <w:r>
-        <w:rPr>
-          <w:rFonts w:hint="eastAsia"/>
-        </w:rPr>
-        <w:t>：用户id，用户的id状态会储存在用户程序中。若为空，则查询用户的所有评论。</w:t>
-      </w:r>
-    </w:p>
-    <w:p>
-      <w:r>
-        <w:rPr>
-          <w:rFonts w:hint="eastAsia"/>
-        </w:rPr>
-        <w:t>count：（根据时间）排序后的符合条件的评论的起始位数</w:t>
-      </w:r>
-    </w:p>
-    <w:p>
-      <w:r>
-        <w:rPr>
-          <w:rFonts w:hint="eastAsia"/>
-        </w:rPr>
-        <w:t>size：一次性返回的评论条数（不足则尽可能返回）</w:t>
-      </w:r>
-    </w:p>
-    <w:p/>
-    <w:p>
-      <w:r>
-        <w:rPr>
-          <w:rFonts w:hint="eastAsia"/>
-        </w:rPr>
-        <w:t>输出：</w:t>
-      </w:r>
-    </w:p>
-    <w:p>
-      <w:r>
-        <w:rPr>
-          <w:rFonts w:hint="eastAsia"/>
-        </w:rPr>
-        <w:t>int</w:t>
-      </w:r>
-      <w:r>
-        <w:t xml:space="preserve"> </w:t>
-      </w:r>
-      <w:r>
-        <w:rPr>
-          <w:rFonts w:hint="eastAsia"/>
-        </w:rPr>
-        <w:t>status；状态参数 （0</w:t>
-      </w:r>
-      <w:r>
-        <w:t xml:space="preserve">: </w:t>
-      </w:r>
-      <w:r>
-        <w:rPr>
-          <w:rFonts w:hint="eastAsia"/>
-        </w:rPr>
-        <w:t>OK，2</w:t>
-      </w:r>
-      <w:r>
-        <w:t xml:space="preserve">001: </w:t>
-      </w:r>
-      <w:proofErr w:type="spellStart"/>
-      <w:r>
-        <w:t>UserNotFound</w:t>
-      </w:r>
-      <w:proofErr w:type="spellEnd"/>
-      <w:r>
-        <w:t xml:space="preserve">, 1002: </w:t>
-      </w:r>
-      <w:proofErr w:type="spellStart"/>
-      <w:r>
-        <w:t>MapNotFound</w:t>
-      </w:r>
-      <w:proofErr w:type="spellEnd"/>
-      <w:r>
-        <w:t xml:space="preserve">, 1014: </w:t>
-      </w:r>
-      <w:proofErr w:type="spellStart"/>
-      <w:r>
-        <w:t>AddNotesError</w:t>
-      </w:r>
-      <w:proofErr w:type="spellEnd"/>
-      <w:r>
-        <w:t>）</w:t>
-      </w:r>
-    </w:p>
-    <w:p>
-      <w:proofErr w:type="gramStart"/>
-      <w:r>
-        <w:rPr>
-          <w:rFonts w:hint="eastAsia"/>
-        </w:rPr>
-        <w:t>list</w:t>
-      </w:r>
-      <w:r>
-        <w:t>[</w:t>
-      </w:r>
-      <w:proofErr w:type="gramEnd"/>
-      <w:r>
-        <w:t>(</w:t>
-      </w:r>
-      <w:proofErr w:type="spellStart"/>
-      <w:r>
-        <w:t>mapid</w:t>
-      </w:r>
-      <w:proofErr w:type="spellEnd"/>
-      <w:r>
-        <w:t xml:space="preserve">, </w:t>
-      </w:r>
-      <w:proofErr w:type="spellStart"/>
-      <w:r>
-        <w:t>uid</w:t>
-      </w:r>
-      <w:proofErr w:type="spellEnd"/>
-      <w:r>
-        <w:t>, time, context)]</w:t>
-      </w:r>
-    </w:p>
-    <w:p/>
+      <w:pPr>
+        <w:rPr>
+          <w:rFonts w:hint="eastAsia"/>
+        </w:rPr>
+      </w:pPr>
+    </w:p>
     <w:sectPr>
       <w:pgSz w:w="11906" w:h="16838"/>
       <w:pgMar w:top="1440" w:right="1800" w:bottom="1440" w:left="1800" w:header="851" w:footer="992" w:gutter="0"/>

</xml_diff>